<commit_message>
ADD: adesso è responsive per il telefono
</commit_message>
<xml_diff>
--- a/AFU.docx
+++ b/AFU.docx
@@ -137,6 +137,15 @@
     </w:p>
     <w:sdt>
       <w:sdtPr>
+        <w:rPr>
+          <w:rFonts w:asciiTheme="minorHAnsi" w:eastAsiaTheme="minorHAnsi" w:hAnsiTheme="minorHAnsi" w:cstheme="minorBidi"/>
+          <w:color w:val="auto"/>
+          <w:kern w:val="2"/>
+          <w:sz w:val="24"/>
+          <w:szCs w:val="24"/>
+          <w:lang w:eastAsia="en-US"/>
+          <w14:ligatures w14:val="standardContextual"/>
+        </w:rPr>
         <w:id w:val="1541780082"/>
         <w:docPartObj>
           <w:docPartGallery w:val="Table of Contents"/>
@@ -145,15 +154,8 @@
       </w:sdtPr>
       <w:sdtEndPr>
         <w:rPr>
-          <w:rFonts w:asciiTheme="minorHAnsi" w:eastAsiaTheme="minorHAnsi" w:hAnsiTheme="minorHAnsi" w:cstheme="minorBidi"/>
           <w:b/>
           <w:bCs/>
-          <w:color w:val="auto"/>
-          <w:kern w:val="2"/>
-          <w:sz w:val="24"/>
-          <w:szCs w:val="24"/>
-          <w:lang w:eastAsia="en-US"/>
-          <w14:ligatures w14:val="standardContextual"/>
         </w:rPr>
       </w:sdtEndPr>
       <w:sdtContent>
@@ -2202,27 +2204,17 @@
         <w:t>Gestione Promozioni (CRUD):</w:t>
       </w:r>
       <w:r>
-        <w:t xml:space="preserve"> Configurazione di sconti temporali applicabili a categorie o prodotti specifici.</w:t>
+        <w:t xml:space="preserve"> Configurazione di sconti temporali applicabili a prodotti specifici.</w:t>
       </w:r>
     </w:p>
     <w:p>
       <w:pPr>
-        <w:pStyle w:val="Nessunaspaziatura"/>
-        <w:numPr>
-          <w:ilvl w:val="0"/>
-          <w:numId w:val="22"/>
-        </w:numPr>
-      </w:pPr>
-      <w:r>
-        <w:rPr>
-          <w:b/>
-          <w:bCs/>
-        </w:rPr>
-        <w:t>Gestione Prenotazioni:</w:t>
-      </w:r>
-      <w:r>
-        <w:t xml:space="preserve"> Visualizzazione dello storico ordini, dettagli dei biglietti e gestione degli stati della transazione.</w:t>
-      </w:r>
+        <w:pStyle w:val="Titolo1"/>
+        <w:rPr>
+          <w:color w:val="C00000"/>
+        </w:rPr>
+      </w:pPr>
+      <w:bookmarkStart w:id="6" w:name="_Toc232580035"/>
     </w:p>
     <w:p>
       <w:pPr>
@@ -2231,12 +2223,10 @@
           <w:color w:val="C00000"/>
         </w:rPr>
       </w:pPr>
-      <w:bookmarkStart w:id="6" w:name="_Toc232580035"/>
       <w:r>
         <w:rPr>
           <w:color w:val="C00000"/>
         </w:rPr>
-        <w:lastRenderedPageBreak/>
         <w:t>3. Specifiche Funzionali di Dettaglio</w:t>
       </w:r>
       <w:bookmarkEnd w:id="6"/>
@@ -2286,10 +2276,10 @@
           <w:b/>
           <w:bCs/>
         </w:rPr>
-        <w:t>Paginazione:</w:t>
-      </w:r>
-      <w:r>
-        <w:t xml:space="preserve"> 5 elementi per pagina.</w:t>
+        <w:t>Visibilità:</w:t>
+      </w:r>
+      <w:r>
+        <w:t xml:space="preserve"> Mostra unicamente gli eventi attivi (data/ora inizio successiva al momento della consultazione).</w:t>
       </w:r>
     </w:p>
     <w:p>
@@ -2305,10 +2295,10 @@
           <w:b/>
           <w:bCs/>
         </w:rPr>
-        <w:t>Visibilità:</w:t>
-      </w:r>
-      <w:r>
-        <w:t xml:space="preserve"> Mostra unicamente gli eventi attivi (data/ora inizio successiva al momento della consultazione).</w:t>
+        <w:t>Ordinamento:</w:t>
+      </w:r>
+      <w:r>
+        <w:t xml:space="preserve"> Cronologico crescente (gli eventi più imminenti appaiono in cima).</w:t>
       </w:r>
     </w:p>
     <w:p>
@@ -2324,25 +2314,6 @@
           <w:b/>
           <w:bCs/>
         </w:rPr>
-        <w:t>Ordinamento:</w:t>
-      </w:r>
-      <w:r>
-        <w:t xml:space="preserve"> Cronologico crescente (gli eventi più imminenti appaiono in cima).</w:t>
-      </w:r>
-    </w:p>
-    <w:p>
-      <w:pPr>
-        <w:pStyle w:val="Nessunaspaziatura"/>
-        <w:numPr>
-          <w:ilvl w:val="0"/>
-          <w:numId w:val="23"/>
-        </w:numPr>
-      </w:pPr>
-      <w:r>
-        <w:rPr>
-          <w:b/>
-          <w:bCs/>
-        </w:rPr>
         <w:t>Informazioni per Card Evento:</w:t>
       </w:r>
     </w:p>
@@ -2379,196 +2350,17 @@
         </w:numPr>
       </w:pPr>
       <w:r>
-        <w:t>Prezzo di partenza (a partire da)</w:t>
-      </w:r>
-    </w:p>
-    <w:p>
-      <w:pPr>
-        <w:pStyle w:val="Nessunaspaziatura"/>
-        <w:numPr>
-          <w:ilvl w:val="1"/>
-          <w:numId w:val="23"/>
-        </w:numPr>
-      </w:pPr>
-      <w:r>
-        <w:t xml:space="preserve">Posti residui disponibili (es. </w:t>
+        <w:t xml:space="preserve">Genere musicale (es. </w:t>
       </w:r>
       <w:r>
         <w:rPr>
           <w:i/>
           <w:iCs/>
         </w:rPr>
-        <w:t>"42 posti rimasti"</w:t>
+        <w:t>Metal, Rock, Punk</w:t>
       </w:r>
       <w:r>
         <w:t>)</w:t>
-      </w:r>
-    </w:p>
-    <w:p>
-      <w:pPr>
-        <w:pStyle w:val="Nessunaspaziatura"/>
-        <w:numPr>
-          <w:ilvl w:val="1"/>
-          <w:numId w:val="23"/>
-        </w:numPr>
-      </w:pPr>
-      <w:r>
-        <w:t xml:space="preserve">Stato dinamico (es. </w:t>
-      </w:r>
-      <w:r>
-        <w:rPr>
-          <w:i/>
-          <w:iCs/>
-        </w:rPr>
-        <w:t>Disponibile</w:t>
-      </w:r>
-      <w:r>
-        <w:t xml:space="preserve">, </w:t>
-      </w:r>
-      <w:r>
-        <w:rPr>
-          <w:i/>
-          <w:iCs/>
-        </w:rPr>
-        <w:t>Quasi esaurito</w:t>
-      </w:r>
-      <w:r>
-        <w:t xml:space="preserve">, </w:t>
-      </w:r>
-      <w:r>
-        <w:rPr>
-          <w:i/>
-          <w:iCs/>
-        </w:rPr>
-        <w:t>Sold out</w:t>
-      </w:r>
-      <w:r>
-        <w:t>)</w:t>
-      </w:r>
-    </w:p>
-    <w:p>
-      <w:pPr>
-        <w:pStyle w:val="Nessunaspaziatura"/>
-        <w:numPr>
-          <w:ilvl w:val="1"/>
-          <w:numId w:val="23"/>
-        </w:numPr>
-      </w:pPr>
-      <w:r>
-        <w:t xml:space="preserve">Genere musicale (es. </w:t>
-      </w:r>
-      <w:r>
-        <w:rPr>
-          <w:i/>
-          <w:iCs/>
-        </w:rPr>
-        <w:t>Metal, Rock, Punk</w:t>
-      </w:r>
-      <w:r>
-        <w:t>)</w:t>
-      </w:r>
-    </w:p>
-    <w:p>
-      <w:pPr>
-        <w:pStyle w:val="Nessunaspaziatura"/>
-        <w:numPr>
-          <w:ilvl w:val="0"/>
-          <w:numId w:val="23"/>
-        </w:numPr>
-      </w:pPr>
-      <w:r>
-        <w:rPr>
-          <w:b/>
-          <w:bCs/>
-        </w:rPr>
-        <w:t>Filtri di Ricerca:</w:t>
-      </w:r>
-    </w:p>
-    <w:p>
-      <w:pPr>
-        <w:pStyle w:val="Nessunaspaziatura"/>
-        <w:numPr>
-          <w:ilvl w:val="1"/>
-          <w:numId w:val="23"/>
-        </w:numPr>
-      </w:pPr>
-      <w:r>
-        <w:rPr>
-          <w:b/>
-          <w:bCs/>
-        </w:rPr>
-        <w:t>Data:</w:t>
-      </w:r>
-      <w:r>
-        <w:t xml:space="preserve"> Shortcut (</w:t>
-      </w:r>
-      <w:r>
-        <w:rPr>
-          <w:i/>
-          <w:iCs/>
-        </w:rPr>
-        <w:t>Oggi</w:t>
-      </w:r>
-      <w:r>
-        <w:t xml:space="preserve">, </w:t>
-      </w:r>
-      <w:r>
-        <w:rPr>
-          <w:i/>
-          <w:iCs/>
-        </w:rPr>
-        <w:t>Questo weekend</w:t>
-      </w:r>
-      <w:r>
-        <w:t>) o intervallo personalizzato (Date Picker).</w:t>
-      </w:r>
-    </w:p>
-    <w:p>
-      <w:pPr>
-        <w:pStyle w:val="Nessunaspaziatura"/>
-        <w:numPr>
-          <w:ilvl w:val="1"/>
-          <w:numId w:val="23"/>
-        </w:numPr>
-      </w:pPr>
-      <w:r>
-        <w:rPr>
-          <w:b/>
-          <w:bCs/>
-        </w:rPr>
-        <w:t>Genere musicale:</w:t>
-      </w:r>
-      <w:r>
-        <w:t xml:space="preserve"> Selezione singola/multipla.</w:t>
-      </w:r>
-    </w:p>
-    <w:p>
-      <w:pPr>
-        <w:pStyle w:val="Nessunaspaziatura"/>
-        <w:numPr>
-          <w:ilvl w:val="1"/>
-          <w:numId w:val="23"/>
-        </w:numPr>
-      </w:pPr>
-      <w:r>
-        <w:rPr>
-          <w:b/>
-          <w:bCs/>
-        </w:rPr>
-        <w:t>Disponibilità:</w:t>
-      </w:r>
-      <w:r>
-        <w:t xml:space="preserve"> Switch per nascondere i </w:t>
-      </w:r>
-      <w:r>
-        <w:rPr>
-          <w:i/>
-          <w:iCs/>
-        </w:rPr>
-        <w:t>Sold out</w:t>
-      </w:r>
-      <w:r>
-        <w:t>.</w:t>
       </w:r>
     </w:p>
     <w:p>
@@ -2792,23 +2584,154 @@
     <w:p>
       <w:pPr>
         <w:pStyle w:val="Nessunaspaziatura"/>
+        <w:ind w:firstLine="708"/>
+      </w:pPr>
+      <w:r>
+        <w:rPr>
+          <w:color w:val="EE0000"/>
+        </w:rPr>
+        <w:t xml:space="preserve">● </w:t>
+      </w:r>
+      <w:r>
+        <w:rPr>
+          <w:b/>
+          <w:bCs/>
+        </w:rPr>
+        <w:t>Rosso (Occupato):</w:t>
+      </w:r>
+      <w:r>
+        <w:t xml:space="preserve"> Non selezionabile, acquistato da altri utenti.</w:t>
+      </w:r>
+    </w:p>
+    <w:p>
+      <w:pPr>
+        <w:pStyle w:val="Nessunaspaziatura"/>
         <w:numPr>
-          <w:ilvl w:val="1"/>
+          <w:ilvl w:val="0"/>
           <w:numId w:val="25"/>
         </w:numPr>
       </w:pPr>
-      <w:r>
-        <w:t xml:space="preserve">● </w:t>
-      </w:r>
+      <w:bookmarkStart w:id="10" w:name="_Toc232580039"/>
+      <w:r>
+        <w:rPr>
+          <w:rStyle w:val="Titolo3Carattere"/>
+          <w:color w:val="6B0F05"/>
+        </w:rPr>
+        <w:t>Step 2 - Selezione Posti</w:t>
+      </w:r>
+      <w:bookmarkEnd w:id="10"/>
       <w:r>
         <w:rPr>
           <w:b/>
           <w:bCs/>
-        </w:rPr>
-        <w:t>Verde (Libero):</w:t>
-      </w:r>
-      <w:r>
-        <w:t xml:space="preserve"> Selezionabile dall'utente.</w:t>
+          <w:color w:val="6B0F05"/>
+        </w:rPr>
+        <w:t>:</w:t>
+      </w:r>
+      <w:r>
+        <w:rPr>
+          <w:color w:val="6B0F05"/>
+        </w:rPr>
+        <w:t xml:space="preserve"> </w:t>
+      </w:r>
+      <w:r>
+        <w:t xml:space="preserve">L'utente blocca i posti cliccando sulla mappa. Il sistema mostra in un pannello laterale il dettaglio (zona, fila, numero, eventuale sovrapprezzo) e applica il vincolo sul </w:t>
+      </w:r>
+      <w:r>
+        <w:rPr>
+          <w:b/>
+          <w:bCs/>
+        </w:rPr>
+        <w:t>numero massimo di posti selezionabili</w:t>
+      </w:r>
+      <w:r>
+        <w:t xml:space="preserve"> per singola transazione.</w:t>
+      </w:r>
+    </w:p>
+    <w:p>
+      <w:pPr>
+        <w:pStyle w:val="Nessunaspaziatura"/>
+        <w:numPr>
+          <w:ilvl w:val="0"/>
+          <w:numId w:val="25"/>
+        </w:numPr>
+      </w:pPr>
+      <w:bookmarkStart w:id="11" w:name="_Toc232580040"/>
+      <w:r>
+        <w:rPr>
+          <w:rStyle w:val="Titolo3Carattere"/>
+          <w:color w:val="6B0F05"/>
+        </w:rPr>
+        <w:t>Step 3 - Inserimento Dati Cliente</w:t>
+      </w:r>
+      <w:bookmarkEnd w:id="11"/>
+      <w:r>
+        <w:rPr>
+          <w:b/>
+          <w:bCs/>
+        </w:rPr>
+        <w:t>:</w:t>
+      </w:r>
+      <w:r>
+        <w:t xml:space="preserve"> Form obbligatorio con i campi: </w:t>
+      </w:r>
+      <w:r>
+        <w:rPr>
+          <w:i/>
+          <w:iCs/>
+        </w:rPr>
+        <w:t>Nome e Cognome</w:t>
+      </w:r>
+      <w:r>
+        <w:t xml:space="preserve">, </w:t>
+      </w:r>
+      <w:r>
+        <w:rPr>
+          <w:i/>
+          <w:iCs/>
+        </w:rPr>
+        <w:t>Indirizzo Email</w:t>
+      </w:r>
+      <w:r>
+        <w:t xml:space="preserve"> (destinazione per il biglietto), </w:t>
+      </w:r>
+      <w:r>
+        <w:rPr>
+          <w:i/>
+          <w:iCs/>
+        </w:rPr>
+        <w:t>Numero di Telefono</w:t>
+      </w:r>
+      <w:r>
+        <w:t>.</w:t>
+      </w:r>
+    </w:p>
+    <w:p>
+      <w:pPr>
+        <w:pStyle w:val="Nessunaspaziatura"/>
+        <w:numPr>
+          <w:ilvl w:val="0"/>
+          <w:numId w:val="25"/>
+        </w:numPr>
+      </w:pPr>
+      <w:bookmarkStart w:id="12" w:name="_Toc232580041"/>
+      <w:r>
+        <w:rPr>
+          <w:rStyle w:val="Titolo3Carattere"/>
+          <w:color w:val="6B0F05"/>
+        </w:rPr>
+        <w:t>Step 4 - Riepilogo e Pagamento</w:t>
+      </w:r>
+      <w:bookmarkEnd w:id="12"/>
+      <w:r>
+        <w:rPr>
+          <w:b/>
+          <w:bCs/>
+        </w:rPr>
+        <w:t>:</w:t>
+      </w:r>
+      <w:r>
+        <w:t xml:space="preserve"> Schermata di review dei dati dell'evento, dei posti occupati e del prezzo totale. Il form di pagamento richiede i dati della carta di credito (Numero, Intestatario, Scadenza, CVV) ma non interroga gateway reali. L'esito viene simulato in base a regole di test:</w:t>
       </w:r>
     </w:p>
     <w:p>
@@ -2820,17 +2743,14 @@
         </w:numPr>
       </w:pPr>
       <w:r>
-        <w:t xml:space="preserve">● </w:t>
-      </w:r>
-      <w:r>
-        <w:rPr>
-          <w:b/>
-          <w:bCs/>
-        </w:rPr>
-        <w:t>Rosso (Occupato):</w:t>
-      </w:r>
-      <w:r>
-        <w:t xml:space="preserve"> Non selezionabile, acquistato da altri utenti.</w:t>
+        <w:rPr>
+          <w:i/>
+          <w:iCs/>
+        </w:rPr>
+        <w:t>Successo:</w:t>
+      </w:r>
+      <w:r>
+        <w:t xml:space="preserve"> Reindirizzamento allo Step 5.</w:t>
       </w:r>
     </w:p>
     <w:p>
@@ -2842,17 +2762,14 @@
         </w:numPr>
       </w:pPr>
       <w:r>
-        <w:t xml:space="preserve">● </w:t>
-      </w:r>
-      <w:r>
-        <w:rPr>
-          <w:b/>
-          <w:bCs/>
-        </w:rPr>
-        <w:t>Giallo (Selezionato):</w:t>
-      </w:r>
-      <w:r>
-        <w:t xml:space="preserve"> Selezionato dall'utente nella sessione corrente.</w:t>
+        <w:rPr>
+          <w:i/>
+          <w:iCs/>
+        </w:rPr>
+        <w:t>Rifiutato:</w:t>
+      </w:r>
+      <w:r>
+        <w:t xml:space="preserve"> Messaggio d'errore a schermo e persistenza nello step di pagamento per un nuovo tentativo.</w:t>
       </w:r>
     </w:p>
     <w:p>
@@ -2863,182 +2780,13 @@
           <w:numId w:val="25"/>
         </w:numPr>
       </w:pPr>
-      <w:bookmarkStart w:id="10" w:name="_Toc232580039"/>
+      <w:bookmarkStart w:id="13" w:name="_Toc232580042"/>
       <w:r>
         <w:rPr>
           <w:rStyle w:val="Titolo3Carattere"/>
           <w:color w:val="6B0F05"/>
         </w:rPr>
-        <w:t>Step 2 - Selezione Posti</w:t>
-      </w:r>
-      <w:bookmarkEnd w:id="10"/>
-      <w:r>
-        <w:rPr>
-          <w:b/>
-          <w:bCs/>
-          <w:color w:val="6B0F05"/>
-        </w:rPr>
-        <w:t>:</w:t>
-      </w:r>
-      <w:r>
-        <w:rPr>
-          <w:color w:val="6B0F05"/>
-        </w:rPr>
-        <w:t xml:space="preserve"> </w:t>
-      </w:r>
-      <w:r>
-        <w:t xml:space="preserve">L'utente blocca i posti cliccando sulla mappa. Il sistema mostra in un pannello laterale il dettaglio (zona, fila, numero, eventuale sovrapprezzo) e applica il vincolo sul </w:t>
-      </w:r>
-      <w:r>
-        <w:rPr>
-          <w:b/>
-          <w:bCs/>
-        </w:rPr>
-        <w:t>numero massimo di posti selezionabili</w:t>
-      </w:r>
-      <w:r>
-        <w:t xml:space="preserve"> per singola transazione.</w:t>
-      </w:r>
-    </w:p>
-    <w:p>
-      <w:pPr>
-        <w:pStyle w:val="Nessunaspaziatura"/>
-        <w:numPr>
-          <w:ilvl w:val="0"/>
-          <w:numId w:val="25"/>
-        </w:numPr>
-      </w:pPr>
-      <w:bookmarkStart w:id="11" w:name="_Toc232580040"/>
-      <w:r>
-        <w:rPr>
-          <w:rStyle w:val="Titolo3Carattere"/>
-          <w:color w:val="6B0F05"/>
-        </w:rPr>
         <w:lastRenderedPageBreak/>
-        <w:t>Step 3 - Inserimento Dati Cliente</w:t>
-      </w:r>
-      <w:bookmarkEnd w:id="11"/>
-      <w:r>
-        <w:rPr>
-          <w:b/>
-          <w:bCs/>
-        </w:rPr>
-        <w:t>:</w:t>
-      </w:r>
-      <w:r>
-        <w:t xml:space="preserve"> Form obbligatorio con i campi: </w:t>
-      </w:r>
-      <w:r>
-        <w:rPr>
-          <w:i/>
-          <w:iCs/>
-        </w:rPr>
-        <w:t>Nome e Cognome</w:t>
-      </w:r>
-      <w:r>
-        <w:t xml:space="preserve">, </w:t>
-      </w:r>
-      <w:r>
-        <w:rPr>
-          <w:i/>
-          <w:iCs/>
-        </w:rPr>
-        <w:t>Indirizzo Email</w:t>
-      </w:r>
-      <w:r>
-        <w:t xml:space="preserve"> (destinazione per il biglietto), </w:t>
-      </w:r>
-      <w:r>
-        <w:rPr>
-          <w:i/>
-          <w:iCs/>
-        </w:rPr>
-        <w:t>Numero di Telefono</w:t>
-      </w:r>
-      <w:r>
-        <w:t>.</w:t>
-      </w:r>
-    </w:p>
-    <w:p>
-      <w:pPr>
-        <w:pStyle w:val="Nessunaspaziatura"/>
-        <w:numPr>
-          <w:ilvl w:val="0"/>
-          <w:numId w:val="25"/>
-        </w:numPr>
-      </w:pPr>
-      <w:bookmarkStart w:id="12" w:name="_Toc232580041"/>
-      <w:r>
-        <w:rPr>
-          <w:rStyle w:val="Titolo3Carattere"/>
-          <w:color w:val="6B0F05"/>
-        </w:rPr>
-        <w:t>Step 4 - Riepilogo e Pagamento</w:t>
-      </w:r>
-      <w:bookmarkEnd w:id="12"/>
-      <w:r>
-        <w:rPr>
-          <w:b/>
-          <w:bCs/>
-        </w:rPr>
-        <w:t>:</w:t>
-      </w:r>
-      <w:r>
-        <w:t xml:space="preserve"> Schermata di review dei dati dell'evento, dei posti occupati e del prezzo totale. Il form di pagamento richiede i dati della carta di credito (Numero, Intestatario, Scadenza, CVV) ma non interroga gateway reali. L'esito viene simulato in base a regole di test:</w:t>
-      </w:r>
-    </w:p>
-    <w:p>
-      <w:pPr>
-        <w:pStyle w:val="Nessunaspaziatura"/>
-        <w:numPr>
-          <w:ilvl w:val="1"/>
-          <w:numId w:val="25"/>
-        </w:numPr>
-      </w:pPr>
-      <w:r>
-        <w:rPr>
-          <w:i/>
-          <w:iCs/>
-        </w:rPr>
-        <w:t>Successo:</w:t>
-      </w:r>
-      <w:r>
-        <w:t xml:space="preserve"> Reindirizzamento allo Step 5.</w:t>
-      </w:r>
-    </w:p>
-    <w:p>
-      <w:pPr>
-        <w:pStyle w:val="Nessunaspaziatura"/>
-        <w:numPr>
-          <w:ilvl w:val="1"/>
-          <w:numId w:val="25"/>
-        </w:numPr>
-      </w:pPr>
-      <w:r>
-        <w:rPr>
-          <w:i/>
-          <w:iCs/>
-        </w:rPr>
-        <w:t>Rifiutato:</w:t>
-      </w:r>
-      <w:r>
-        <w:t xml:space="preserve"> Messaggio d'errore a schermo e persistenza nello step di pagamento per un nuovo tentativo.</w:t>
-      </w:r>
-    </w:p>
-    <w:p>
-      <w:pPr>
-        <w:pStyle w:val="Nessunaspaziatura"/>
-        <w:numPr>
-          <w:ilvl w:val="0"/>
-          <w:numId w:val="25"/>
-        </w:numPr>
-      </w:pPr>
-      <w:bookmarkStart w:id="13" w:name="_Toc232580042"/>
-      <w:r>
-        <w:rPr>
-          <w:rStyle w:val="Titolo3Carattere"/>
-          <w:color w:val="6B0F05"/>
-        </w:rPr>
         <w:t>Step 5 - Schermata di Conferma:</w:t>
       </w:r>
       <w:bookmarkEnd w:id="13"/>
@@ -3098,7 +2846,13 @@
         <w:t>Associazione Layout:</w:t>
       </w:r>
       <w:r>
-        <w:t xml:space="preserve"> Scelta obbligatoria del modello di sala (es. "Configurazione Sedie e Tavoli" vs "Configurazione Live in Piedi").</w:t>
+        <w:t xml:space="preserve"> Scelta obbligatoria del modello di sala (Configurazione </w:t>
+      </w:r>
+      <w:r>
+        <w:t>tavoli</w:t>
+      </w:r>
+      <w:r>
+        <w:t>).</w:t>
       </w:r>
     </w:p>
     <w:p>
@@ -3303,6 +3057,9 @@
           <w:ilvl w:val="0"/>
           <w:numId w:val="28"/>
         </w:numPr>
+        <w:rPr>
+          <w:color w:val="C00000"/>
+        </w:rPr>
       </w:pPr>
       <w:r>
         <w:rPr>
@@ -3312,27 +3069,29 @@
         <w:t>I Concerti (Events):</w:t>
       </w:r>
       <w:r>
-        <w:t xml:space="preserve"> Entità contenente ID evento, artista/nome serata, data, ora inizio, prezzo base del biglietto, capienza massima e flag di stato (es. </w:t>
-      </w:r>
-      <w:r>
-        <w:rPr>
-          <w:i/>
-          <w:iCs/>
-        </w:rPr>
-        <w:t>Bozza, Pubblicato</w:t>
-      </w:r>
-      <w:r>
-        <w:t>).</w:t>
+        <w:t xml:space="preserve"> Entità contenente ID evento, artista/nome serata, data, ora inizio</w:t>
+      </w:r>
+      <w:bookmarkStart w:id="18" w:name="_Toc232580047"/>
+      <w:r>
+        <w:t>.</w:t>
       </w:r>
     </w:p>
     <w:p>
       <w:pPr>
-        <w:pStyle w:val="Titolo2"/>
+        <w:pStyle w:val="Nessunaspaziatura"/>
+        <w:rPr>
+          <w:b/>
+          <w:bCs/>
+        </w:rPr>
+      </w:pPr>
+    </w:p>
+    <w:p>
+      <w:pPr>
+        <w:pStyle w:val="Nessunaspaziatura"/>
         <w:rPr>
           <w:color w:val="C00000"/>
         </w:rPr>
       </w:pPr>
-      <w:bookmarkStart w:id="18" w:name="_Toc232580047"/>
       <w:r>
         <w:rPr>
           <w:color w:val="C00000"/>
@@ -3373,7 +3132,6 @@
           <w:b/>
           <w:bCs/>
         </w:rPr>
-        <w:lastRenderedPageBreak/>
         <w:t>Sedie e Tavoli (Seats/Places):</w:t>
       </w:r>
       <w:r>
@@ -3384,7 +3142,7 @@
           <w:i/>
           <w:iCs/>
         </w:rPr>
-        <w:t>Tavolo VIP, Sedia standard, Posto in piedi</w:t>
+        <w:t>Tavolo VIP, Sedia standard</w:t>
       </w:r>
       <w:r>
         <w:t xml:space="preserve">), e </w:t>
@@ -3429,35 +3187,6 @@
           <w:b/>
           <w:bCs/>
         </w:rPr>
-        <w:t>Scontrino / Riepilogo (Orders):</w:t>
-      </w:r>
-      <w:r>
-        <w:t xml:space="preserve"> Record della transazione principale. Contiene i dati del cliente (Nome, Email, Telefono), il timestamp, il totale economico calcolato e lo stato del pagamento mockato (</w:t>
-      </w:r>
-      <w:r>
-        <w:rPr>
-          <w:i/>
-          <w:iCs/>
-        </w:rPr>
-        <w:t>Success/Failed</w:t>
-      </w:r>
-      <w:r>
-        <w:t>).</w:t>
-      </w:r>
-    </w:p>
-    <w:p>
-      <w:pPr>
-        <w:pStyle w:val="Nessunaspaziatura"/>
-        <w:numPr>
-          <w:ilvl w:val="0"/>
-          <w:numId w:val="30"/>
-        </w:numPr>
-      </w:pPr>
-      <w:r>
-        <w:rPr>
-          <w:b/>
-          <w:bCs/>
-        </w:rPr>
         <w:t>Dettaglio Biglietti (Order Items):</w:t>
       </w:r>
       <w:r>
@@ -3522,6 +3251,7 @@
           <w:b/>
           <w:bCs/>
         </w:rPr>
+        <w:lastRenderedPageBreak/>
         <w:t>Cibi e Bevande (Products):</w:t>
       </w:r>
       <w:r>
@@ -8658,6 +8388,7 @@
   <w:style w:type="character" w:default="1" w:styleId="Carpredefinitoparagrafo">
     <w:name w:val="Default Paragraph Font"/>
     <w:uiPriority w:val="1"/>
+    <w:semiHidden/>
     <w:unhideWhenUsed/>
   </w:style>
   <w:style w:type="table" w:default="1" w:styleId="Tabellanormale">

</xml_diff>